<commit_message>
Week 7: review homework answers; fix radar speed meaning; camera-only table by default
- Observatory table defaults to objects in the front camera (toggle for all around)
- Radar speed column is the object's own speed (ego speed already subtracted);
  q10/q11 wording and explanation updated (ego at ~9 km/h in the rain scene)
- q4/q5 hints, f5/f7 explanations, L3 slides 10/12/15 notes, handouts synced

Co-Authored-By: Claude Opus 5.5 <noreply@anthropic.com>
</commit_message>
<xml_diff>
--- a/第七週(10-22)/Nguyên lý xe tự lái_Tuần 7_Tài liệu học tập.docx
+++ b/第七週(10-22)/Nguyên lý xe tự lái_Tuần 7_Tài liệu học tập.docx
@@ -9642,7 +9642,7 @@
       <w:r>
         <w:drawing>
           <wp:inline distT="0" distB="0" distL="0" distR="0">
-            <wp:extent cx="5715000" cy="2857500"/>
+            <wp:extent cx="5715000" cy="3143250"/>
             <wp:effectExtent t="0" r="0" b="0" l="0"/>
             <wp:docPr id="1" name="" descr="" title=""/>
             <wp:cNvGraphicFramePr>
@@ -9667,7 +9667,7 @@
                   <pic:spPr bwMode="auto">
                     <a:xfrm>
                       <a:off x="0" y="0"/>
-                      <a:ext cx="5715000" cy="2857500"/>
+                      <a:ext cx="5715000" cy="3143250"/>
                     </a:xfrm>
                     <a:prstGeom prst="rect">
                       <a:avLst/>
@@ -9754,7 +9754,7 @@
           <w:sz w:val="22"/>
           <w:szCs w:val="22"/>
         </w:rPr>
-        <w:t xml:space="preserve">Bảng bên phải: mỗi vật có khoảng cách, điểm lidar, điểm radar, tốc độ radar đo (chỉ đo phần lại gần hay ra xa, đi ngang thì gần 0), và có nằm trong ảnh camera trước không (không thì ghi bên trái, bên phải, phía sau).</w:t>
+        <w:t xml:space="preserve">Bảng bên phải: mỗi vật có khoảng cách, điểm lidar, điểm radar, tốc độ radar đo (tốc độ của chính vật đó, đã trừ tốc độ xe mình; chỉ đo phần lại gần hay ra xa, đi ngang thì gần 0), và có nằm trong ảnh camera trước không. Bảng mặc định chỉ liệt kê vật trong ảnh camera trước; bấm «Tất cả quanh xe» sẽ liệt kê cả vật bên hông, phía sau, ghi nó ở bên trái, bên phải hay phía sau.</w:t>
       </w:r>
     </w:p>
     <w:p>

</xml_diff>

<commit_message>
Week 7 L2 slide 4: calibration = intrinsics + extrinsics; the demo shows an extrinsic error
Co-Authored-By: Claude Opus 5.5 <noreply@anthropic.com>
</commit_message>
<xml_diff>
--- a/第七週(10-22)/Nguyên lý xe tự lái_Tuần 7_Tài liệu học tập.docx
+++ b/第七週(10-22)/Nguyên lý xe tự lái_Tuần 7_Tài liệu học tập.docx
@@ -6069,7 +6069,7 @@
           <w:sz w:val="22"/>
           <w:szCs w:val="22"/>
         </w:rPr>
-        <w:t xml:space="preserve">hiệu chuẩn</w:t>
+        <w:t xml:space="preserve">hiệu chuẩn tham số ngoài</w:t>
       </w:r>
       <w:r>
         <w:rPr>
@@ -6078,7 +6078,27 @@
           <w:sz w:val="22"/>
           <w:szCs w:val="22"/>
         </w:rPr>
-        <w:t xml:space="preserve">.</w:t>
+        <w:t xml:space="preserve">. Hiệu chuẩn còn một nửa nữa, tuần 5 đã học: </w:t>
+      </w:r>
+      <w:r>
+        <w:rPr>
+          <w:rFonts w:ascii="Arial" w:cs="Arial" w:eastAsia="Arial" w:hAnsi="Arial"/>
+          <w:b/>
+          <w:bCs/>
+          <w:color w:val="24405C"/>
+          <w:sz w:val="22"/>
+          <w:szCs w:val="22"/>
+        </w:rPr>
+        <w:t xml:space="preserve">tham số trong</w:t>
+      </w:r>
+      <w:r>
+        <w:rPr>
+          <w:rFonts w:ascii="Arial" w:cs="Arial" w:eastAsia="Arial" w:hAnsi="Arial"/>
+          <w:color w:val="1B1B1B"/>
+          <w:sz w:val="22"/>
+          <w:szCs w:val="22"/>
+        </w:rPr>
+        <w:t xml:space="preserve"> là chuyện bên trong cảm biến, ví dụ ống kính camera cong bao nhiêu, tâm ảnh nằm ở điểm ảnh nào, phải hiệu chuẩn trước; chiếu điểm lidar lên ảnh thì cần cả tham số ngoài lẫn tham số trong. Hình dưới minh hoạ tham số ngoài bị sai.</w:t>
       </w:r>
     </w:p>
     <w:p>

</xml_diff>

<commit_message>
Week 7 L2 slide 7: explain why early/mid/late fusion need different alignment precision
Co-Authored-By: Claude Opus 5.5 <noreply@anthropic.com>
</commit_message>
<xml_diff>
--- a/第七週(10-22)/Nguyên lý xe tự lái_Tuần 7_Tài liệu học tập.docx
+++ b/第七週(10-22)/Nguyên lý xe tự lái_Tuần 7_Tài liệu học tập.docx
@@ -6848,7 +6848,7 @@
                 <w:sz w:val="18"/>
                 <w:szCs w:val="18"/>
               </w:rPr>
-              <w:t xml:space="preserve">Rất chuẩn (lệch 4° là trượt)</w:t>
+              <w:t xml:space="preserve">Rất chuẩn: từng điểm đúng điểm ảnh</w:t>
             </w:r>
           </w:p>
         </w:tc>
@@ -6876,7 +6876,7 @@
                 <w:sz w:val="18"/>
                 <w:szCs w:val="18"/>
               </w:rPr>
-              <w:t xml:space="preserve">Vừa</w:t>
+              <w:t xml:space="preserve">Vừa: đúng cùng một ô</w:t>
             </w:r>
           </w:p>
         </w:tc>
@@ -7175,6 +7175,82 @@
           <w:szCs w:val="19"/>
         </w:rPr>
         <w:t xml:space="preserve">Giữ càng nhiều thông tin thì càng phải căn chỉnh chuẩn: không cách nào thắng ở mọi hàng, xe thật thường dùng trộn.</w:t>
+      </w:r>
+    </w:p>
+    <w:p>
+      <w:pPr>
+        <w:widowControl/>
+        <w:spacing w:after="100" w:before="0" w:line="312"/>
+        <w:ind w:left="0" w:firstLine="0"/>
+      </w:pPr>
+      <w:r>
+        <w:rPr>
+          <w:rFonts w:ascii="Arial" w:cs="Arial" w:eastAsia="Arial" w:hAnsi="Arial"/>
+          <w:color w:val="1B1B1B"/>
+          <w:sz w:val="22"/>
+          <w:szCs w:val="22"/>
+        </w:rPr>
+        <w:t xml:space="preserve">Vì sao yêu cầu căn chỉnh khác nhau nhiều vậy? Xem thứ cần căn có lớn không. </w:t>
+      </w:r>
+      <w:r>
+        <w:rPr>
+          <w:rFonts w:ascii="Arial" w:cs="Arial" w:eastAsia="Arial" w:hAnsi="Arial"/>
+          <w:b/>
+          <w:bCs/>
+          <w:color w:val="24405C"/>
+          <w:sz w:val="22"/>
+          <w:szCs w:val="22"/>
+        </w:rPr>
+        <w:t xml:space="preserve">Ghép sớm</w:t>
+      </w:r>
+      <w:r>
+        <w:rPr>
+          <w:rFonts w:ascii="Arial" w:cs="Arial" w:eastAsia="Arial" w:hAnsi="Arial"/>
+          <w:color w:val="1B1B1B"/>
+          <w:sz w:val="22"/>
+          <w:szCs w:val="22"/>
+        </w:rPr>
+        <w:t xml:space="preserve"> căn từng điểm: người đi bộ rộng khoảng 70 cm, đứng cách 20 m, lệch 1 độ thì điểm lệch 35 cm, gần một nửa rơi ra nền phía sau. </w:t>
+      </w:r>
+      <w:r>
+        <w:rPr>
+          <w:rFonts w:ascii="Arial" w:cs="Arial" w:eastAsia="Arial" w:hAnsi="Arial"/>
+          <w:b/>
+          <w:bCs/>
+          <w:color w:val="24405C"/>
+          <w:sz w:val="22"/>
+          <w:szCs w:val="22"/>
+        </w:rPr>
+        <w:t xml:space="preserve">Ghép giữa</w:t>
+      </w:r>
+      <w:r>
+        <w:rPr>
+          <w:rFonts w:ascii="Arial" w:cs="Arial" w:eastAsia="Arial" w:hAnsi="Arial"/>
+          <w:color w:val="1B1B1B"/>
+          <w:sz w:val="22"/>
+          <w:szCs w:val="22"/>
+        </w:rPr>
+        <w:t xml:space="preserve"> căn theo ô trên bản đồ nhìn từ trên: lệch chút vẫn cùng ô hoặc ô bên cạnh, và vì học từ rất nhiều dữ liệu nên chịu được lệch nhỏ. </w:t>
+      </w:r>
+      <w:r>
+        <w:rPr>
+          <w:rFonts w:ascii="Arial" w:cs="Arial" w:eastAsia="Arial" w:hAnsi="Arial"/>
+          <w:b/>
+          <w:bCs/>
+          <w:color w:val="24405C"/>
+          <w:sz w:val="22"/>
+          <w:szCs w:val="22"/>
+        </w:rPr>
+        <w:t xml:space="preserve">Ghép muộn</w:t>
+      </w:r>
+      <w:r>
+        <w:rPr>
+          <w:rFonts w:ascii="Arial" w:cs="Arial" w:eastAsia="Arial" w:hAnsi="Arial"/>
+          <w:color w:val="1B1B1B"/>
+          <w:sz w:val="22"/>
+          <w:szCs w:val="22"/>
+        </w:rPr>
+        <w:t xml:space="preserve"> căn cả một vật: camera nói 20 m, radar nói 20,3 m, một ô tô rộng gần 2 m, dài 4,5 m, lệch 30 cm vẫn nằm trên thân xe. Nhưng dễ hơn không có nghĩa là khỏi hiệu chuẩn: lệch tới mức bằng khoảng cách giữa hai xe thì tốc độ radar sẽ bị gán cho xe bên cạnh.</w:t>
       </w:r>
     </w:p>
     <w:p>

</xml_diff>

<commit_message>
Week 7 L2 slide 8: every fusion needs association; late fusion is where it takes judgement
Co-Authored-By: Claude Opus 5.5 <noreply@anthropic.com>
</commit_message>
<xml_diff>
--- a/第七週(10-22)/Nguyên lý xe tự lái_Tuần 7_Tài liệu học tập.docx
+++ b/第七週(10-22)/Nguyên lý xe tự lái_Tuần 7_Tài liệu học tập.docx
@@ -7330,7 +7330,7 @@
           <w:sz w:val="22"/>
           <w:szCs w:val="22"/>
         </w:rPr>
-        <w:t xml:space="preserve">Bước quan trọng nhất của ghép muộn là </w:t>
+        <w:t xml:space="preserve">Cách ghép nào cũng phải </w:t>
       </w:r>
       <w:r>
         <w:rPr>
@@ -7350,7 +7350,7 @@
           <w:sz w:val="22"/>
           <w:szCs w:val="22"/>
         </w:rPr>
-        <w:t xml:space="preserve">: điểm radar này với hộp nào của camera là cùng một vật? Như ghép tên trong danh sách với khuôn mặt trong ảnh lớp. Đơn giản nhất là xem vị trí, thêm tốc độ: một điểm đứng yên không thể là xe đang chạy. Điểm không thuộc hộp nào (lan can, cây) phải bỏ đi đúng cách.</w:t>
+        <w:t xml:space="preserve">, tức là biết dữ liệu nào nói về cùng một vật, chỉ khác là ghép cái gì. Ghép sớm là một điểm với một điểm ảnh, ghép giữa là một ô với một ô, hiệu chuẩn xong thì tính ra bằng công thức; ghép muộn là danh sách với danh sách, cái nào đi với cái nào phải tự phán đoán, nên dễ sai nhất: điểm radar này với hộp nào của camera là cùng một vật? Như ghép tên trong danh sách với khuôn mặt trong ảnh lớp. Đơn giản nhất là xem vị trí, thêm tốc độ: một điểm đứng yên không thể là xe đang chạy. Điểm không thuộc hộp nào (lan can, cây) phải bỏ đi đúng cách.</w:t>
       </w:r>
     </w:p>
     <w:p>

</xml_diff>

<commit_message>
Week 7 L2 slide 8: late fusion matches radar targets to camera boxes (object to object)
Co-Authored-By: Claude Opus 5.5 <noreply@anthropic.com>
</commit_message>
<xml_diff>
--- a/第七週(10-22)/Nguyên lý xe tự lái_Tuần 7_Tài liệu học tập.docx
+++ b/第七週(10-22)/Nguyên lý xe tự lái_Tuần 7_Tài liệu học tập.docx
@@ -7314,7 +7314,7 @@
           <w:sz w:val="19"/>
           <w:szCs w:val="19"/>
         </w:rPr>
-        <w:t xml:space="preserve">Ghép đôi: điểm radar nào thuộc hộp nào? Hộp xanh có điểm radar, hộp vàng (người đi bộ, xe ở xa) thì không. scene-0103. Dữ liệu: nuScenes (Motional), CC BY-NC-SA 4.0</w:t>
+        <w:t xml:space="preserve">Nguyên liệu của ghép đôi: điểm radar rơi vào hộp nào? Hộp xanh có điểm radar, hộp vàng (người đi bộ, xe ở xa) thì không. Hộp do người gán nhãn. scene-0103. Dữ liệu: nuScenes (Motional), CC BY-NC-SA 4.0</w:t>
       </w:r>
     </w:p>
     <w:p>
@@ -7350,7 +7350,7 @@
           <w:sz w:val="22"/>
           <w:szCs w:val="22"/>
         </w:rPr>
-        <w:t xml:space="preserve">, tức là biết dữ liệu nào nói về cùng một vật, chỉ khác là ghép cái gì. Ghép sớm là một điểm với một điểm ảnh, ghép giữa là một ô với một ô, hiệu chuẩn xong thì tính ra bằng công thức; ghép muộn là danh sách với danh sách, cái nào đi với cái nào phải tự phán đoán, nên dễ sai nhất: điểm radar này với hộp nào của camera là cùng một vật? Như ghép tên trong danh sách với khuôn mặt trong ảnh lớp. Đơn giản nhất là xem vị trí, thêm tốc độ: một điểm đứng yên không thể là xe đang chạy. Điểm không thuộc hộp nào (lan can, cây) phải bỏ đi đúng cách.</w:t>
+        <w:t xml:space="preserve">, tức là biết dữ liệu nào nói về cùng một vật, chỉ khác là ghép cái gì. Ghép sớm là một điểm với một điểm ảnh, ghép giữa là một ô với một ô, hiệu chuẩn xong thì tính ra bằng công thức; ghép muộn là danh sách với danh sách, cái nào đi với cái nào phải tự phán đoán, nên dễ sai nhất: mục tiêu này trong danh sách radar với hộp nào trong danh sách camera là cùng một vật? Radar gom mấy điểm trên cùng một xe thành một mục tiêu (ví dụ «20 m, 30 km/h»), camera cũng tự tìm hộp, cuối cùng mới ghép vật với vật. Hình trên vẽ thẳng điểm radar để thấy nguyên liệu, hộp do người gán nhãn. Như ghép tên trong danh sách với khuôn mặt trong ảnh lớp. Đơn giản nhất là xem vị trí, thêm tốc độ: một mục tiêu đứng yên không thể là xe đang chạy. Điểm không thuộc hộp nào (lan can, cây) phải bỏ đi đúng cách.</w:t>
       </w:r>
     </w:p>
     <w:p>

</xml_diff>